<commit_message>
Expand service offerings and refresh site content
Co-authored-by: Copilot <223556219+Copilot@users.noreply.github.com>
</commit_message>
<xml_diff>
--- a/docs/service-guides/environmental-services.docx
+++ b/docs/service-guides/environmental-services.docx
@@ -36,7 +36,7 @@
         <w:pStyle w:val="Title"/>
       </w:pPr>
       <w:r>
-        <w:t xml:space="preserve">Environmental Services</w:t>
+        <w:t xml:space="preserve">Environmental Services &amp; MPCB Consent Support</w:t>
       </w:r>
     </w:p>
     <w:p>
@@ -44,7 +44,7 @@
         <w:pStyle w:val="Subtitle"/>
       </w:pPr>
       <w:r>
-        <w:t xml:space="preserve">Baseline studies, monitoring and compliance support for projects that need evidence from field to filing.</w:t>
+        <w:t xml:space="preserve">Consent to Establish, Consent to Operate, renewal and environmental compliance support for industries and infrastructure projects.</w:t>
       </w:r>
     </w:p>
     <w:p>
@@ -104,7 +104,7 @@
         <w:pStyle w:val="Normal"/>
       </w:pPr>
       <w:r>
-        <w:t xml:space="preserve">Environmental work is useful when field observations, laboratory results, project assumptions and approval conditions describe the same project. ACE supports clients with monitoring, baseline information, environmental data packs, EIA/EMP technical inputs and consent-condition organization through the project life cycle.</w:t>
+        <w:t xml:space="preserve">Environmental consent is not a one-time formality. It connects the proposed site, process, investment, emissions, effluent, waste streams, pollution-control systems and operating conditions to the regulator’s review. ACE coordinates the technical file through Aadhar Enviro: application inputs, document collation, monitoring, site-readiness checks, replies to queries and renewal evidence.</w:t>
       </w:r>
     </w:p>
     <w:p>
@@ -112,7 +112,7 @@
         <w:pStyle w:val="Normal"/>
       </w:pPr>
       <w:r>
-        <w:t xml:space="preserve">The service can include ambient air, stack or source, water, wastewater, soil, noise and waste-related monitoring; laboratory coordination; baseline studies; compliance calendars; consent-to-establish or consent-to-operate support; and technical reporting for industry, mining, highways, urban works, energy and infrastructure.</w:t>
+        <w:t xml:space="preserve">The service is designed around Maharashtra Pollution Control Board requirements for Consent to Establish, Consent to Operate, renewal, amendment and expansion, while also coordinating the wider environmental work that may support an industrial or infrastructure project: air, water, effluent, noise, waste, baseline, EIA/EMP and compliance records.</w:t>
       </w:r>
     </w:p>
     <w:p>
@@ -120,7 +120,7 @@
         <w:pStyle w:val="Normal"/>
       </w:pPr>
       <w:r>
-        <w:t xml:space="preserve">Environmental clearances, consents, authorizations and statutory certifications are not automatically issued by a consultant. The responsible project proponent, competent authority or appropriately qualified and recognized consultant retains the legal responsibility for the relevant submission and approval.</w:t>
+        <w:t xml:space="preserve">Environmental clearances, consents, authorizations and statutory certifications are not automatically issued by a consultant. The project proponent, competent authority and appropriately qualified or recognized consultant retain the legal responsibility for the relevant submission and approval.</w:t>
       </w:r>
     </w:p>
     <w:p>
@@ -137,7 +137,7 @@
         <w:pStyle w:val="Normal"/>
       </w:pPr>
       <w:r>
-        <w:t xml:space="preserve">The scope is set against the project stage and approval pathway: site selection, baseline study, construction monitoring, operational compliance, expansion, renewal, lender due diligence or investigation of a complaint or non-conformance.</w:t>
+        <w:t xml:space="preserve">The assignment can begin with a new industrial proposal requiring Consent to Establish, a unit preparing for first Consent to Operate, an operating facility approaching renewal, or a project facing amendment, expansion, change in product, capacity or pollution-control configuration. The team maps the activity, site and land documents, capital investment, manufacturing process, raw materials, water balance, emissions, effluent, hazardous or other waste, biomedical waste where relevant, pollution-control systems and previous consent conditions.</w:t>
       </w:r>
     </w:p>
     <w:p>
@@ -145,7 +145,7 @@
         <w:pStyle w:val="Normal"/>
       </w:pPr>
       <w:r>
-        <w:t xml:space="preserve">Field and technical work may include monitoring plans, sampling locations and frequencies, air, water, noise, soil, stack, waste or emissions data, laboratory coordination, baseline interpretation, consent-condition registers, compliance calendars and follow-up action tracking.</w:t>
+        <w:t xml:space="preserve">The technical package can include project reports, site and layout plans, process flow, raw-material and product details, water and wastewater balance, emission sources, pollution-control equipment, waste-management arrangements, monitoring plans, laboratory records, environmental-clearance references and compliance declarations as applicable to the current MPCB route.</w:t>
       </w:r>
     </w:p>
     <w:p>
@@ -153,7 +153,7 @@
         <w:pStyle w:val="Normal"/>
       </w:pPr>
       <w:r>
-        <w:t xml:space="preserve">The final reporting format should distinguish measured data, calculated values, assumptions, limitations, laboratory status, applicable standard and the project condition or decision the result supports.</w:t>
+        <w:t xml:space="preserve">The final report distinguishes measured data, calculated values, assumptions, limitations, laboratory status, applicable standard and the project condition or decision the result supports. Current MPCB/CPCB directions and the issued consent order control category, conditions and validity; older tables should not be used without checking the current authority position.</w:t>
       </w:r>
     </w:p>
     <w:p>
@@ -231,7 +231,7 @@
               <w:rPr>
                 <w:color w:val="25323A"/>
               </w:rPr>
-              <w:t xml:space="preserve">Ambient-air monitoring</w:t>
+              <w:t xml:space="preserve">Consent to Establish</w:t>
             </w:r>
           </w:p>
         </w:tc>
@@ -247,7 +247,7 @@
               <w:rPr>
                 <w:color w:val="25323A"/>
               </w:rPr>
-              <w:t xml:space="preserve">Plan and coordinate sampling for PM10, PM2.5 and applicable gaseous parameters against the required monitoring method, location, frequency and authority criterion.</w:t>
+              <w:t xml:space="preserve">Support the application before construction, installation or expansion by organizing the project report, site, process, investment, pollution-control and environmental information required for the current MPCB route.</w:t>
             </w:r>
           </w:p>
         </w:tc>
@@ -265,7 +265,7 @@
               <w:rPr>
                 <w:color w:val="25323A"/>
               </w:rPr>
-              <w:t xml:space="preserve">Stack and source monitoring</w:t>
+              <w:t xml:space="preserve">Consent to Operate</w:t>
             </w:r>
           </w:p>
         </w:tc>
@@ -281,7 +281,7 @@
               <w:rPr>
                 <w:color w:val="25323A"/>
               </w:rPr>
-              <w:t xml:space="preserve">Support stack, process-emission, fugitive-emission or source monitoring where the equipment, method, access and qualified personnel are confirmed.</w:t>
+              <w:t xml:space="preserve">Prepare operational details, pollution-control evidence, monitoring records and site-readiness inputs before production, commissioning or operation of the approved unit.</w:t>
             </w:r>
           </w:p>
         </w:tc>
@@ -299,7 +299,7 @@
               <w:rPr>
                 <w:color w:val="25323A"/>
               </w:rPr>
-              <w:t xml:space="preserve">Water, effluent and soil</w:t>
+              <w:t xml:space="preserve">Renewal, amendment and expansion</w:t>
             </w:r>
           </w:p>
         </w:tc>
@@ -315,7 +315,7 @@
               <w:rPr>
                 <w:color w:val="25323A"/>
               </w:rPr>
-              <w:t xml:space="preserve">Coordinate surface-water, groundwater, drinking-water, effluent, soil and waste sampling with representative locations, preservation and laboratory records.</w:t>
+              <w:t xml:space="preserve">Review the existing consent, actual activity, conditions, monitoring history and proposed changes, then prepare the renewal, amendment or expansion evidence package.</w:t>
             </w:r>
           </w:p>
         </w:tc>
@@ -333,7 +333,7 @@
               <w:rPr>
                 <w:color w:val="25323A"/>
               </w:rPr>
-              <w:t xml:space="preserve">Environmental-noise surveys</w:t>
+              <w:t xml:space="preserve">Application and document coordination</w:t>
             </w:r>
           </w:p>
         </w:tc>
@@ -349,7 +349,7 @@
               <w:rPr>
                 <w:color w:val="25323A"/>
               </w:rPr>
-              <w:t xml:space="preserve">Measure construction, industrial or boundary noise at agreed locations and periods using the applicable method and reporting basis.</w:t>
+              <w:t xml:space="preserve">Collate land and site documents, layout, process flow, raw materials, products, water balance, emissions, effluent, waste, equipment and declarations; support online filing and query responses.</w:t>
             </w:r>
           </w:p>
         </w:tc>
@@ -367,7 +367,7 @@
               <w:rPr>
                 <w:color w:val="25323A"/>
               </w:rPr>
-              <w:t xml:space="preserve">Baseline and EIA/EMP technical inputs</w:t>
+              <w:t xml:space="preserve">Pollution-potential and category screening</w:t>
             </w:r>
           </w:p>
         </w:tc>
@@ -383,7 +383,7 @@
               <w:rPr>
                 <w:color w:val="25323A"/>
               </w:rPr>
-              <w:t xml:space="preserve">Support baseline design, data review, impact or mitigation inputs and environmental-management records for the appointed project and qualified consultant pathway.</w:t>
+              <w:t xml:space="preserve">Review the current MPCB/CPCB category, pollution-index approach, sector list, activity and consent requirement rather than relying on an outdated generic Red/Orange/Green/White table.</w:t>
             </w:r>
           </w:p>
         </w:tc>
@@ -401,7 +401,7 @@
               <w:rPr>
                 <w:color w:val="25323A"/>
               </w:rPr>
-              <w:t xml:space="preserve">Consent and compliance support</w:t>
+              <w:t xml:space="preserve">Air, stack and noise monitoring</w:t>
             </w:r>
           </w:p>
         </w:tc>
@@ -417,7 +417,7 @@
               <w:rPr>
                 <w:color w:val="25323A"/>
               </w:rPr>
-              <w:t xml:space="preserve">Organize consent-to-establish or consent-to-operate information, condition registers, monitoring calendars, renewal evidence and technical responses.</w:t>
+              <w:t xml:space="preserve">Plan and coordinate PM10, PM2.5, gaseous, stack, process, fugitive, workplace or environmental-noise monitoring against the confirmed method, locations, frequency and authority criterion.</w:t>
             </w:r>
           </w:p>
         </w:tc>
@@ -435,7 +435,7 @@
               <w:rPr>
                 <w:color w:val="25323A"/>
               </w:rPr>
-              <w:t xml:space="preserve">Reporting and action tracking</w:t>
+              <w:t xml:space="preserve">Water, effluent, soil and waste evidence</w:t>
             </w:r>
           </w:p>
         </w:tc>
@@ -451,7 +451,41 @@
               <w:rPr>
                 <w:color w:val="25323A"/>
               </w:rPr>
-              <w:t xml:space="preserve">Prepare CPCB, MPPCB, lender or client data packs, identify gaps, assign follow-up actions and maintain a traceable record from field to review.</w:t>
+              <w:t xml:space="preserve">Coordinate surface-water, groundwater, drinking-water, effluent, soil, hazardous-waste, other-waste and biomedical-waste records with representative sampling, preservation and laboratory documentation.</w:t>
+            </w:r>
+          </w:p>
+        </w:tc>
+      </w:tr>
+      <w:tr>
+        <w:tc>
+          <w:tcPr>
+            <w:tcW w:w="3000" w:type="dxa"/>
+          </w:tcPr>
+          <w:p>
+            <w:pPr>
+              <w:pStyle w:val="TableText"/>
+            </w:pPr>
+            <w:r>
+              <w:rPr>
+                <w:color w:val="25323A"/>
+              </w:rPr>
+              <w:t xml:space="preserve">Baseline, EIA/EMP and compliance inputs</w:t>
+            </w:r>
+          </w:p>
+        </w:tc>
+        <w:tc>
+          <w:tcPr>
+            <w:tcW w:w="6900" w:type="dxa"/>
+          </w:tcPr>
+          <w:p>
+            <w:pPr>
+              <w:pStyle w:val="TableText"/>
+            </w:pPr>
+            <w:r>
+              <w:rPr>
+                <w:color w:val="25323A"/>
+              </w:rPr>
+              <w:t xml:space="preserve">Support baseline design, data review, technical EIA/EMP inputs, consent-condition registers, monitoring calendars, corrective actions and lender or client reporting.</w:t>
             </w:r>
           </w:p>
         </w:tc>
@@ -556,7 +590,7 @@
               <w:rPr>
                 <w:color w:val="25323A"/>
               </w:rPr>
-              <w:t xml:space="preserve">Environment (Protection) Act and Rules, Air Act, Water Act and applicable notifications or conditions for the project and activity.</w:t>
+              <w:t xml:space="preserve">Water (Prevention and Control of Pollution) Act, 1974; Air (Prevention and Control of Pollution) Act, 1981; Environment (Protection) Act and Rules; and applicable notifications or consent conditions.</w:t>
             </w:r>
           </w:p>
         </w:tc>
@@ -590,7 +624,7 @@
               <w:rPr>
                 <w:color w:val="25323A"/>
               </w:rPr>
-              <w:t xml:space="preserve">EIA Notification, 2006 as amended, applicable Terms of Reference, environmental-clearance conditions, PARIVESH requirements and authority formats.</w:t>
+              <w:t xml:space="preserve">EIA Notification, 2006 as amended, applicable Terms of Reference, environmental-clearance conditions, PARIVESH requirements and authority formats where the project triggers them.</w:t>
             </w:r>
           </w:p>
         </w:tc>
@@ -608,6 +642,74 @@
               <w:rPr>
                 <w:color w:val="25323A"/>
               </w:rPr>
+              <w:t xml:space="preserve">MPCB consent route</w:t>
+            </w:r>
+          </w:p>
+        </w:tc>
+        <w:tc>
+          <w:tcPr>
+            <w:tcW w:w="7300" w:type="dxa"/>
+          </w:tcPr>
+          <w:p>
+            <w:pPr>
+              <w:pStyle w:val="TableText"/>
+            </w:pPr>
+            <w:r>
+              <w:rPr>
+                <w:color w:val="25323A"/>
+              </w:rPr>
+              <w:t xml:space="preserve">Current MPCB consent procedures, application and portal requirements, consent orders, category directions, sector-specific circulars, waste authorizations and conditions for the Maharashtra site.</w:t>
+            </w:r>
+          </w:p>
+        </w:tc>
+      </w:tr>
+      <w:tr>
+        <w:tc>
+          <w:tcPr>
+            <w:tcW w:w="2600" w:type="dxa"/>
+          </w:tcPr>
+          <w:p>
+            <w:pPr>
+              <w:pStyle w:val="TableText"/>
+            </w:pPr>
+            <w:r>
+              <w:rPr>
+                <w:color w:val="25323A"/>
+              </w:rPr>
+              <w:t xml:space="preserve">CPCB categorization</w:t>
+            </w:r>
+          </w:p>
+        </w:tc>
+        <w:tc>
+          <w:tcPr>
+            <w:tcW w:w="7300" w:type="dxa"/>
+          </w:tcPr>
+          <w:p>
+            <w:pPr>
+              <w:pStyle w:val="TableText"/>
+            </w:pPr>
+            <w:r>
+              <w:rPr>
+                <w:color w:val="25323A"/>
+              </w:rPr>
+              <w:t xml:space="preserve">Current CPCB industry categorization, pollution-index methodology and revised Red, Orange, Green, White, Blue or sector-specific directions applicable at the time of filing. The issued consent order controls the project.</w:t>
+            </w:r>
+          </w:p>
+        </w:tc>
+      </w:tr>
+      <w:tr>
+        <w:tc>
+          <w:tcPr>
+            <w:tcW w:w="2600" w:type="dxa"/>
+          </w:tcPr>
+          <w:p>
+            <w:pPr>
+              <w:pStyle w:val="TableText"/>
+            </w:pPr>
+            <w:r>
+              <w:rPr>
+                <w:color w:val="25323A"/>
+              </w:rPr>
               <w:t xml:space="preserve">CPCB references</w:t>
             </w:r>
           </w:p>
@@ -624,7 +726,7 @@
               <w:rPr>
                 <w:color w:val="25323A"/>
               </w:rPr>
-              <w:t xml:space="preserve">National Ambient Air Quality Standards, air-monitoring guidance, water-quality criteria, industry-specific emission or effluent standards and CPCB technical guidance.</w:t>
+              <w:t xml:space="preserve">National Ambient Air Quality Standards, emission and effluent standards, monitoring guidance, water-quality criteria, industry-specific requirements and CPCB technical guidance.</w:t>
             </w:r>
           </w:p>
         </w:tc>
@@ -692,41 +794,7 @@
               <w:rPr>
                 <w:color w:val="25323A"/>
               </w:rPr>
-              <w:t xml:space="preserve">Noise Pollution (Regulation and Control) Rules, 2000 and current applicable Solid Waste, C&amp;D Waste, Hazardous and Other Wastes, Plastic, E-Waste and Battery Waste rules and EPR requirements.</w:t>
-            </w:r>
-          </w:p>
-        </w:tc>
-      </w:tr>
-      <w:tr>
-        <w:tc>
-          <w:tcPr>
-            <w:tcW w:w="2600" w:type="dxa"/>
-          </w:tcPr>
-          <w:p>
-            <w:pPr>
-              <w:pStyle w:val="TableText"/>
-            </w:pPr>
-            <w:r>
-              <w:rPr>
-                <w:color w:val="25323A"/>
-              </w:rPr>
-              <w:t xml:space="preserve">Madhya Pradesh requirements</w:t>
-            </w:r>
-          </w:p>
-        </w:tc>
-        <w:tc>
-          <w:tcPr>
-            <w:tcW w:w="7300" w:type="dxa"/>
-          </w:tcPr>
-          <w:p>
-            <w:pPr>
-              <w:pStyle w:val="TableText"/>
-            </w:pPr>
-            <w:r>
-              <w:rPr>
-                <w:color w:val="25323A"/>
-              </w:rPr>
-              <w:t xml:space="preserve">MPPCB consent-to-establish/operate, waste authorization, monitoring and reporting conditions; SEIAA-MP/SEAC-MP requirements where applicable.</w:t>
+              <w:t xml:space="preserve">Noise Pollution (Regulation and Control) Rules, 2000 and current Solid Waste, C&amp;D Waste, Hazardous and Other Wastes, Plastic, E-Waste, Battery Waste and Biomedical Waste requirements where triggered.</w:t>
             </w:r>
           </w:p>
         </w:tc>
@@ -792,31 +860,43 @@
         </w:numPr>
       </w:pPr>
       <w:r>
-        <w:t xml:space="preserve">Industrial and manufacturing facilities, process plants and logistics operations.</w:t>
-      </w:r>
-    </w:p>
-    <w:p>
-      <w:pPr>
-        <w:pStyle w:val="ListParagraph"/>
-        <w:numPr>
-          <w:ilvl w:val="0"/>
-          <w:numId w:val="1"/>
-        </w:numPr>
-      </w:pPr>
-      <w:r>
-        <w:t xml:space="preserve">Mining, quarrying, mineral-processing and construction-material projects.</w:t>
-      </w:r>
-    </w:p>
-    <w:p>
-      <w:pPr>
-        <w:pStyle w:val="ListParagraph"/>
-        <w:numPr>
-          <w:ilvl w:val="0"/>
-          <w:numId w:val="1"/>
-        </w:numPr>
-      </w:pPr>
-      <w:r>
-        <w:t xml:space="preserve">Highway, railway, water, urban, energy and other linear or public-infrastructure projects.</w:t>
+        <w:t xml:space="preserve">Industrial project owners, developers, manufacturing facilities and process plants.</w:t>
+      </w:r>
+    </w:p>
+    <w:p>
+      <w:pPr>
+        <w:pStyle w:val="ListParagraph"/>
+        <w:numPr>
+          <w:ilvl w:val="0"/>
+          <w:numId w:val="1"/>
+        </w:numPr>
+      </w:pPr>
+      <w:r>
+        <w:t xml:space="preserve">Chemical, pharmaceutical, food, textile, engineering and construction-material units.</w:t>
+      </w:r>
+    </w:p>
+    <w:p>
+      <w:pPr>
+        <w:pStyle w:val="ListParagraph"/>
+        <w:numPr>
+          <w:ilvl w:val="0"/>
+          <w:numId w:val="1"/>
+        </w:numPr>
+      </w:pPr>
+      <w:r>
+        <w:t xml:space="preserve">Mining, quarrying, mineral-processing, energy, utility and logistics operations.</w:t>
+      </w:r>
+    </w:p>
+    <w:p>
+      <w:pPr>
+        <w:pStyle w:val="ListParagraph"/>
+        <w:numPr>
+          <w:ilvl w:val="0"/>
+          <w:numId w:val="1"/>
+        </w:numPr>
+      </w:pPr>
+      <w:r>
+        <w:t xml:space="preserve">Healthcare institutions and other biomedical-waste generators where authorization is triggered.</w:t>
       </w:r>
     </w:p>
     <w:p>
@@ -840,31 +920,19 @@
         </w:numPr>
       </w:pPr>
       <w:r>
-        <w:t xml:space="preserve">Municipal bodies, wastewater-treatment operators and construction or demolition projects.</w:t>
-      </w:r>
-    </w:p>
-    <w:p>
-      <w:pPr>
-        <w:pStyle w:val="ListParagraph"/>
-        <w:numPr>
-          <w:ilvl w:val="0"/>
-          <w:numId w:val="1"/>
-        </w:numPr>
-      </w:pPr>
-      <w:r>
-        <w:t xml:space="preserve">Lender’s engineers and environmental due-diligence teams.</w:t>
-      </w:r>
-    </w:p>
-    <w:p>
-      <w:pPr>
-        <w:pStyle w:val="ListParagraph"/>
-        <w:numPr>
-          <w:ilvl w:val="0"/>
-          <w:numId w:val="1"/>
-        </w:numPr>
-      </w:pPr>
-      <w:r>
-        <w:t xml:space="preserve">Project proponents coordinating statutory submissions through an appointed qualified or recognized consultant.</w:t>
+        <w:t xml:space="preserve">Infrastructure, highway, railway, water, urban and public-project proponents.</w:t>
+      </w:r>
+    </w:p>
+    <w:p>
+      <w:pPr>
+        <w:pStyle w:val="ListParagraph"/>
+        <w:numPr>
+          <w:ilvl w:val="0"/>
+          <w:numId w:val="1"/>
+        </w:numPr>
+      </w:pPr>
+      <w:r>
+        <w:t xml:space="preserve">Lender’s engineers and project teams coordinating statutory submissions through an appointed qualified or recognized consultant.</w:t>
       </w:r>
     </w:p>
     <w:p>
@@ -893,7 +961,7 @@
         </w:numPr>
       </w:pPr>
       <w:r>
-        <w:t xml:space="preserve">Confirm the project location, activity, capacity, process, fuel, approval stage, monitoring history and authority or consultant format.</w:t>
+        <w:t xml:space="preserve">Identify the jurisdiction, project stage and route: Consent to Establish, Consent to Operate, renewal, amendment, expansion or authorization.</w:t>
       </w:r>
     </w:p>
     <w:p>
@@ -905,7 +973,7 @@
         </w:numPr>
       </w:pPr>
       <w:r>
-        <w:t xml:space="preserve">Map the applicable approval, consent, monitoring, laboratory, waste and reporting requirements and identify information gaps.</w:t>
+        <w:t xml:space="preserve">Review the activity, site, investment, process, raw materials, products, water balance, emissions, effluent, waste, pollution-control systems and existing conditions.</w:t>
       </w:r>
     </w:p>
     <w:p>
@@ -917,7 +985,7 @@
         </w:numPr>
       </w:pPr>
       <w:r>
-        <w:t xml:space="preserve">Prepare the monitoring plan, locations, parameters, frequency, safety controls, chain of custody and field schedule.</w:t>
+        <w:t xml:space="preserve">Map the current MPCB/CPCB category, sector directions, environmental-clearance trigger, monitoring, laboratory, waste and reporting requirements.</w:t>
       </w:r>
     </w:p>
     <w:p>
@@ -929,7 +997,7 @@
         </w:numPr>
       </w:pPr>
       <w:r>
-        <w:t xml:space="preserve">Collect representative field samples and observations, coordinating the appropriate laboratory and recognized pathway where required.</w:t>
+        <w:t xml:space="preserve">Prepare the application inputs, drawings, reports, declarations, pollution-control plan, monitoring schedule and evidence register.</w:t>
       </w:r>
     </w:p>
     <w:p>
@@ -941,7 +1009,7 @@
         </w:numPr>
       </w:pPr>
       <w:r>
-        <w:t xml:space="preserve">Review data quality, compare results with the applicable condition or standard and record assumptions, limitations and deviations.</w:t>
+        <w:t xml:space="preserve">Coordinate site visits, sampling, laboratory records, readiness checks and responses to authority queries or inspection observations.</w:t>
       </w:r>
     </w:p>
     <w:p>
@@ -953,7 +1021,7 @@
         </w:numPr>
       </w:pPr>
       <w:r>
-        <w:t xml:space="preserve">Prepare the technical report, compliance register, EIA/EMP input or submission support pack within the agreed role.</w:t>
+        <w:t xml:space="preserve">Track the submitted case, consent conditions, corrective actions, monitoring periods, renewal dates and follow-up evidence.</w:t>
       </w:r>
     </w:p>
     <w:p>
@@ -965,7 +1033,7 @@
         </w:numPr>
       </w:pPr>
       <w:r>
-        <w:t xml:space="preserve">Track queries, corrective actions, renewals, monitoring periods and follow-up evidence with the project team.</w:t>
+        <w:t xml:space="preserve">Maintain the compliance calendar and next-cycle renewal dossier with the project team.</w:t>
       </w:r>
     </w:p>
     <w:p>
@@ -986,67 +1054,79 @@
         </w:numPr>
       </w:pPr>
       <w:r>
-        <w:t xml:space="preserve">Baseline, monitoring and sampling plans with location, parameter and frequency schedules.</w:t>
-      </w:r>
-    </w:p>
-    <w:p>
-      <w:pPr>
-        <w:pStyle w:val="ListParagraph"/>
-        <w:numPr>
-          <w:ilvl w:val="0"/>
-          <w:numId w:val="1"/>
-        </w:numPr>
-      </w:pPr>
-      <w:r>
-        <w:t xml:space="preserve">Ambient-air, stack, water, effluent, soil, waste and environmental-noise monitoring reports.</w:t>
-      </w:r>
-    </w:p>
-    <w:p>
-      <w:pPr>
-        <w:pStyle w:val="ListParagraph"/>
-        <w:numPr>
-          <w:ilvl w:val="0"/>
-          <w:numId w:val="1"/>
-        </w:numPr>
-      </w:pPr>
-      <w:r>
-        <w:t xml:space="preserve">Laboratory coordination, sample registers, chain-of-custody and data-quality records.</w:t>
-      </w:r>
-    </w:p>
-    <w:p>
-      <w:pPr>
-        <w:pStyle w:val="ListParagraph"/>
-        <w:numPr>
-          <w:ilvl w:val="0"/>
-          <w:numId w:val="1"/>
-        </w:numPr>
-      </w:pPr>
-      <w:r>
-        <w:t xml:space="preserve">Baseline study, EIA/EMP technical inputs and environmental data packs.</w:t>
-      </w:r>
-    </w:p>
-    <w:p>
-      <w:pPr>
-        <w:pStyle w:val="ListParagraph"/>
-        <w:numPr>
-          <w:ilvl w:val="0"/>
-          <w:numId w:val="1"/>
-        </w:numPr>
-      </w:pPr>
-      <w:r>
-        <w:t xml:space="preserve">Consent-condition registers, compliance calendars, renewal evidence and action trackers.</w:t>
-      </w:r>
-    </w:p>
-    <w:p>
-      <w:pPr>
-        <w:pStyle w:val="ListParagraph"/>
-        <w:numPr>
-          <w:ilvl w:val="0"/>
-          <w:numId w:val="1"/>
-        </w:numPr>
-      </w:pPr>
-      <w:r>
-        <w:t xml:space="preserve">CPCB, MPPCB, lender or client reporting and technical response packs where included.</w:t>
+        <w:t xml:space="preserve">Consent to Establish application and technical submission pack.</w:t>
+      </w:r>
+    </w:p>
+    <w:p>
+      <w:pPr>
+        <w:pStyle w:val="ListParagraph"/>
+        <w:numPr>
+          <w:ilvl w:val="0"/>
+          <w:numId w:val="1"/>
+        </w:numPr>
+      </w:pPr>
+      <w:r>
+        <w:t xml:space="preserve">Consent to Operate and renewal evidence pack.</w:t>
+      </w:r>
+    </w:p>
+    <w:p>
+      <w:pPr>
+        <w:pStyle w:val="ListParagraph"/>
+        <w:numPr>
+          <w:ilvl w:val="0"/>
+          <w:numId w:val="1"/>
+        </w:numPr>
+      </w:pPr>
+      <w:r>
+        <w:t xml:space="preserve">Process, site, water-balance, emission, effluent, waste and pollution-control schedules.</w:t>
+      </w:r>
+    </w:p>
+    <w:p>
+      <w:pPr>
+        <w:pStyle w:val="ListParagraph"/>
+        <w:numPr>
+          <w:ilvl w:val="0"/>
+          <w:numId w:val="1"/>
+        </w:numPr>
+      </w:pPr>
+      <w:r>
+        <w:t xml:space="preserve">Monitoring plans, sample registers, chain-of-custody and laboratory-coordination records.</w:t>
+      </w:r>
+    </w:p>
+    <w:p>
+      <w:pPr>
+        <w:pStyle w:val="ListParagraph"/>
+        <w:numPr>
+          <w:ilvl w:val="0"/>
+          <w:numId w:val="1"/>
+        </w:numPr>
+      </w:pPr>
+      <w:r>
+        <w:t xml:space="preserve">Baseline, EIA/EMP, environmental due-diligence and authority-response inputs.</w:t>
+      </w:r>
+    </w:p>
+    <w:p>
+      <w:pPr>
+        <w:pStyle w:val="ListParagraph"/>
+        <w:numPr>
+          <w:ilvl w:val="0"/>
+          <w:numId w:val="1"/>
+        </w:numPr>
+      </w:pPr>
+      <w:r>
+        <w:t xml:space="preserve">Consent-condition register, compliance calendar, renewal evidence and corrective-action tracker.</w:t>
+      </w:r>
+    </w:p>
+    <w:p>
+      <w:pPr>
+        <w:pStyle w:val="ListParagraph"/>
+        <w:numPr>
+          <w:ilvl w:val="0"/>
+          <w:numId w:val="1"/>
+        </w:numPr>
+      </w:pPr>
+      <w:r>
+        <w:t xml:space="preserve">MPCB, CPCB, lender or client reporting packs where included in the appointment.</w:t>
       </w:r>
     </w:p>
     <w:p>
@@ -1067,67 +1147,67 @@
         </w:numPr>
       </w:pPr>
       <w:r>
-        <w:t xml:space="preserve">Earlier visibility of air, water, noise, waste and emissions risks.</w:t>
-      </w:r>
-    </w:p>
-    <w:p>
-      <w:pPr>
-        <w:pStyle w:val="ListParagraph"/>
-        <w:numPr>
-          <w:ilvl w:val="0"/>
-          <w:numId w:val="1"/>
-        </w:numPr>
-      </w:pPr>
-      <w:r>
-        <w:t xml:space="preserve">Better baseline and compliance data for project, EHS, lender and authority review.</w:t>
-      </w:r>
-    </w:p>
-    <w:p>
-      <w:pPr>
-        <w:pStyle w:val="ListParagraph"/>
-        <w:numPr>
-          <w:ilvl w:val="0"/>
-          <w:numId w:val="1"/>
-        </w:numPr>
-      </w:pPr>
-      <w:r>
-        <w:t xml:space="preserve">Fewer missed monitoring periods, incomplete records and avoidable re-submissions.</w:t>
-      </w:r>
-    </w:p>
-    <w:p>
-      <w:pPr>
-        <w:pStyle w:val="ListParagraph"/>
-        <w:numPr>
-          <w:ilvl w:val="0"/>
-          <w:numId w:val="1"/>
-        </w:numPr>
-      </w:pPr>
-      <w:r>
-        <w:t xml:space="preserve">A traceable bridge between field observations, laboratory results and consent conditions.</w:t>
-      </w:r>
-    </w:p>
-    <w:p>
-      <w:pPr>
-        <w:pStyle w:val="ListParagraph"/>
-        <w:numPr>
-          <w:ilvl w:val="0"/>
-          <w:numId w:val="1"/>
-        </w:numPr>
-      </w:pPr>
-      <w:r>
-        <w:t xml:space="preserve">Clearer assignment of follow-up actions, owners, dates and evidence.</w:t>
-      </w:r>
-    </w:p>
-    <w:p>
-      <w:pPr>
-        <w:pStyle w:val="ListParagraph"/>
-        <w:numPr>
-          <w:ilvl w:val="0"/>
-          <w:numId w:val="1"/>
-        </w:numPr>
-      </w:pPr>
-      <w:r>
-        <w:t xml:space="preserve">Better coordination between field teams, laboratories, EHS teams and statutory consultants.</w:t>
+        <w:t xml:space="preserve">A consent file that connects the proposed activity to its actual site and pollution-control plan.</w:t>
+      </w:r>
+    </w:p>
+    <w:p>
+      <w:pPr>
+        <w:pStyle w:val="ListParagraph"/>
+        <w:numPr>
+          <w:ilvl w:val="0"/>
+          <w:numId w:val="1"/>
+        </w:numPr>
+      </w:pPr>
+      <w:r>
+        <w:t xml:space="preserve">Fewer avoidable gaps in process, water, emission, effluent and waste information.</w:t>
+      </w:r>
+    </w:p>
+    <w:p>
+      <w:pPr>
+        <w:pStyle w:val="ListParagraph"/>
+        <w:numPr>
+          <w:ilvl w:val="0"/>
+          <w:numId w:val="1"/>
+        </w:numPr>
+      </w:pPr>
+      <w:r>
+        <w:t xml:space="preserve">Clearer readiness for scrutiny, site visits, queries and consent conditions.</w:t>
+      </w:r>
+    </w:p>
+    <w:p>
+      <w:pPr>
+        <w:pStyle w:val="ListParagraph"/>
+        <w:numPr>
+          <w:ilvl w:val="0"/>
+          <w:numId w:val="1"/>
+        </w:numPr>
+      </w:pPr>
+      <w:r>
+        <w:t xml:space="preserve">Monitoring data and compliance records that EHS teams can explain and maintain.</w:t>
+      </w:r>
+    </w:p>
+    <w:p>
+      <w:pPr>
+        <w:pStyle w:val="ListParagraph"/>
+        <w:numPr>
+          <w:ilvl w:val="0"/>
+          <w:numId w:val="1"/>
+        </w:numPr>
+      </w:pPr>
+      <w:r>
+        <w:t xml:space="preserve">Fewer missed renewal dates, incomplete submissions and preventable re-submissions.</w:t>
+      </w:r>
+    </w:p>
+    <w:p>
+      <w:pPr>
+        <w:pStyle w:val="ListParagraph"/>
+        <w:numPr>
+          <w:ilvl w:val="0"/>
+          <w:numId w:val="1"/>
+        </w:numPr>
+      </w:pPr>
+      <w:r>
+        <w:t xml:space="preserve">A traceable bridge between field observations, laboratory results and regulatory commitments.</w:t>
       </w:r>
     </w:p>
     <w:p>
@@ -1148,7 +1228,7 @@
         </w:numPr>
       </w:pPr>
       <w:r>
-        <w:t xml:space="preserve">ACE can support monitoring, baseline data, technical inputs, coordination and compliance records; it does not itself issue environmental clearance, consent, authorization or statutory certification unless legally authorized and specifically appointed to do so.</w:t>
+        <w:t xml:space="preserve">ACE can support monitoring, technical inputs, coordination and compliance records; it does not itself issue environmental clearance, consent, authorization or statutory certification unless legally authorized and specifically appointed to do so.</w:t>
       </w:r>
     </w:p>
     <w:p>
@@ -1184,7 +1264,7 @@
         </w:numPr>
       </w:pPr>
       <w:r>
-        <w:t xml:space="preserve">Applicable rules, consent conditions, emission or effluent standards and waste/EPR requirements must be checked for the activity, location and current regulatory edition.</w:t>
+        <w:t xml:space="preserve">Category, validity, emission or effluent limits, consent conditions and waste requirements must be checked against the current MPCB/CPCB direction and issued consent order; the guide is not a substitute for the current order.</w:t>
       </w:r>
     </w:p>
     <w:p>
@@ -1214,7 +1294,7 @@
         <w:keepNext/>
       </w:pPr>
       <w:r>
-        <w:t xml:space="preserve">When should environmental monitoring begin?</w:t>
+        <w:t xml:space="preserve">When should Consent to Establish be started?</w:t>
       </w:r>
     </w:p>
     <w:p>
@@ -1222,7 +1302,7 @@
         <w:pStyle w:val="Normal"/>
       </w:pPr>
       <w:r>
-        <w:t xml:space="preserve">Bring the environmental team in during siting and planning so that monitoring periods, project assumptions and consent requirements are aligned before filing or construction.</w:t>
+        <w:t xml:space="preserve">Start before construction, installation or expansion. The site, process, investment, raw materials, water balance, emissions, effluent, waste and pollution-control plan should be aligned before the application is filed and before works begin.</w:t>
       </w:r>
     </w:p>
     <w:p>
@@ -1231,7 +1311,7 @@
         <w:keepNext/>
       </w:pPr>
       <w:r>
-        <w:t xml:space="preserve">What information is needed for an environmental-services brief?</w:t>
+        <w:t xml:space="preserve">What is needed for Consent to Operate or renewal?</w:t>
       </w:r>
     </w:p>
     <w:p>
@@ -1239,7 +1319,7 @@
         <w:pStyle w:val="Normal"/>
       </w:pPr>
       <w:r>
-        <w:t xml:space="preserve">Share the project location, activity, capacity, fuel or process details, current approval stage, monitoring history and the authority or consultant format required.</w:t>
+        <w:t xml:space="preserve">Share the approved project and consent documents, production or operation details, actual pollution-control systems, monitoring and laboratory records, waste records, previous conditions, compliance status and any proposed change in activity or capacity.</w:t>
       </w:r>
     </w:p>
     <w:p>
@@ -1248,7 +1328,7 @@
         <w:keepNext/>
       </w:pPr>
       <w:r>
-        <w:t xml:space="preserve">Can ACE issue an environmental clearance or consent?</w:t>
+        <w:t xml:space="preserve">Which industries need MPCB consent?</w:t>
       </w:r>
     </w:p>
     <w:p>
@@ -1256,7 +1336,7 @@
         <w:pStyle w:val="Normal"/>
       </w:pPr>
       <w:r>
-        <w:t xml:space="preserve">No. ACE can support monitoring, baseline data, technical inputs, coordination and compliance records. The responsible project proponent, competent authority and appointed qualified or recognized consultant handle statutory applications, approvals and certifications.</w:t>
+        <w:t xml:space="preserve">The route depends on the activity and its potential to discharge sewage or trade effluent, emit air pollutants, generate or handle regulated waste, or otherwise fall within the Board’s consent or authorization framework. Category and documentation are confirmed against the current MPCB/CPCB directions for the site and sector.</w:t>
       </w:r>
     </w:p>
     <w:p>
@@ -1265,7 +1345,7 @@
         <w:keepNext/>
       </w:pPr>
       <w:r>
-        <w:t xml:space="preserve">How long should baseline monitoring continue?</w:t>
+        <w:t xml:space="preserve">How long is an MPCB consent valid?</w:t>
       </w:r>
     </w:p>
     <w:p>
@@ -1273,7 +1353,24 @@
         <w:pStyle w:val="Normal"/>
       </w:pPr>
       <w:r>
-        <w:t xml:space="preserve">The required period depends on the project category, authority Terms of Reference, seasonality, parameter, site and submission pathway. The monitoring plan should be agreed before fieldwork begins.</w:t>
+        <w:t xml:space="preserve">Validity is not a universal fixed number. It depends on the consent type, category, sector, project stage, consent order and current Board directions. The issued order is the controlling document, and renewal should be planned before its expiry.</w:t>
+      </w:r>
+    </w:p>
+    <w:p>
+      <w:pPr>
+        <w:pStyle w:val="Heading3"/>
+        <w:keepNext/>
+      </w:pPr>
+      <w:r>
+        <w:t xml:space="preserve">Can ACE issue the MPCB consent or environmental clearance?</w:t>
+      </w:r>
+    </w:p>
+    <w:p>
+      <w:pPr>
+        <w:pStyle w:val="Normal"/>
+      </w:pPr>
+      <w:r>
+        <w:t xml:space="preserve">No. ACE can prepare technical inputs, coordinate monitoring and laboratory evidence, support the application, answer queries and maintain compliance records. The competent authority issues the consent or approval, while the project proponent and appointed qualified or recognized consultant retain their statutory responsibilities.</w:t>
       </w:r>
     </w:p>
     <w:p>
@@ -1359,7 +1456,7 @@
               <w:rPr>
                 <w:color w:val="25323A"/>
               </w:rPr>
-              <w:t xml:space="preserve">Ambient-air monitoring in Madhya Pradesh</w:t>
+              <w:t xml:space="preserve">Environmental compliance checklist before operation</w:t>
             </w:r>
           </w:p>
         </w:tc>
@@ -1375,7 +1472,7 @@
               <w:rPr>
                 <w:color w:val="25323A"/>
               </w:rPr>
-              <w:t xml:space="preserve">An environmental technician in PPE operating a particulate sampler at an industrial or highway site, with realistic Indian surroundings and safe access controls. Search keywords: ambient air quality monitoring India PM2.5 field technician</w:t>
+              <w:t xml:space="preserve">A compliance professional reviewing an industrial consent checklist with process, waste, pollution-control and monitoring evidence; keep all client data fictional or unreadable. Search keywords: MPCB consent compliance checklist industrial unit India</w:t>
             </w:r>
           </w:p>
         </w:tc>
@@ -1409,7 +1506,7 @@
               <w:rPr>
                 <w:color w:val="25323A"/>
               </w:rPr>
-              <w:t xml:space="preserve">A field sampler collecting a labelled water sample from an industrial drain or surface-water location with chain-of-custody materials visible. Search keywords: environmental water sampling India effluent monitoring field</w:t>
+              <w:t xml:space="preserve">A field sampler collecting a labelled surface-water or effluent sample with chain-of-custody materials and safe access controls visible. Search keywords: environmental water sampling India effluent monitoring field</w:t>
             </w:r>
           </w:p>
         </w:tc>
@@ -1427,7 +1524,7 @@
               <w:rPr>
                 <w:color w:val="25323A"/>
               </w:rPr>
-              <w:t xml:space="preserve">Environmental noise survey</w:t>
+              <w:t xml:space="preserve">Stack-emission monitoring and pollution control</w:t>
             </w:r>
           </w:p>
         </w:tc>
@@ -1443,7 +1540,7 @@
               <w:rPr>
                 <w:color w:val="25323A"/>
               </w:rPr>
-              <w:t xml:space="preserve">A technician using a sound-level meter near a construction or industrial boundary, with no staged unsafe access to machinery. Search keywords: environmental noise monitoring sound level meter India construction</w:t>
+              <w:t xml:space="preserve">An industrial stack or emission-control system used as a visual cue for source monitoring, compliance review and pollution-control planning; visible smoke alone does not prove a violation. Search keywords: industrial stack emission monitoring pollution control India</w:t>
             </w:r>
           </w:p>
         </w:tc>
@@ -1503,7 +1600,15 @@
         <w:pStyle w:val="Small"/>
       </w:pPr>
       <w:r>
-        <w:t xml:space="preserve">Madhya Pradesh Pollution Control Board: https://www.mppcb.mp.gov.in/</w:t>
+        <w:t xml:space="preserve">Maharashtra Pollution Control Board: https://www.mpcb.gov.in/</w:t>
+      </w:r>
+    </w:p>
+    <w:p>
+      <w:pPr>
+        <w:pStyle w:val="Small"/>
+      </w:pPr>
+      <w:r>
+        <w:t xml:space="preserve">MPCB consent management: https://www.mpcb.gov.in/consent-management</w:t>
       </w:r>
     </w:p>
     <w:p>
@@ -1528,7 +1633,7 @@
         <w:pStyle w:val="Normal"/>
       </w:pPr>
       <w:r>
-        <w:t xml:space="preserve">Environmental compliance is strongest when the project described in the baseline, consent file and monitoring report is the project that is actually built and operated. Good records make that comparison possible.</w:t>
+        <w:t xml:space="preserve">MPCB consent work is strongest when the project described in the application, consent order, monitoring record and operating site is the same project. Good technical records make that comparison possible.</w:t>
       </w:r>
     </w:p>
     <w:p>
@@ -1536,7 +1641,7 @@
         <w:pStyle w:val="Normal"/>
       </w:pPr>
       <w:r>
-        <w:t xml:space="preserve">Before appointment, the client should confirm the activity and capacity, site and approval stage, applicable authority, monitoring period, laboratory pathway, statutory consultant, report format and responsibility for implementing actions.</w:t>
+        <w:t xml:space="preserve">Before appointment, the client should confirm the site jurisdiction, activity and capacity, consent stage, category, current authority directions, monitoring period, laboratory pathway, qualified consultant, report format and responsibility for implementing conditions.</w:t>
       </w:r>
     </w:p>
     <w:sectPr>

</xml_diff>